<commit_message>
fix: contrato usa pagamento_json do request; dados cliente do projeto.json como fallback; placeholders data e assinatura no template
</commit_message>
<xml_diff>
--- a/config/contrato_template.docx
+++ b/config/contrato_template.docx
@@ -9629,7 +9629,7 @@
           <w:b/>
           <w:sz w:val="18"/>
         </w:rPr>
-        <w:t xml:space="preserve">São José dos Campos - SP, 09 de junho de </w:t>
+        <w:t>São José dos Campos - SP, {{ data_contrato }}.</w:t>
       </w:r>
       <w:r>
         <w:rPr>
@@ -9638,7 +9638,6 @@
           <w:spacing w:val="-2"/>
           <w:sz w:val="18"/>
         </w:rPr>
-        <w:t>2026.</w:t>
       </w:r>
     </w:p>
     <w:p>
@@ -9939,7 +9938,7 @@
           <w:b/>
           <w:sz w:val="18"/>
         </w:rPr>
-        <w:t>berê</w:t>
+        <w:t>{{ consultor_nome }}</w:t>
       </w:r>
       <w:r>
         <w:rPr>
@@ -9948,7 +9947,6 @@
           <w:spacing w:val="-15"/>
           <w:sz w:val="18"/>
         </w:rPr>
-        <w:t xml:space="preserve"> </w:t>
       </w:r>
       <w:r>
         <w:rPr>
@@ -9956,7 +9954,6 @@
           <w:b/>
           <w:sz w:val="18"/>
         </w:rPr>
-        <w:t>Ferreira</w:t>
       </w:r>
       <w:r>
         <w:rPr>
@@ -9965,7 +9962,6 @@
           <w:spacing w:val="-12"/>
           <w:sz w:val="18"/>
         </w:rPr>
-        <w:t xml:space="preserve"> </w:t>
       </w:r>
       <w:r>
         <w:rPr>
@@ -9973,7 +9969,6 @@
           <w:b/>
           <w:sz w:val="18"/>
         </w:rPr>
-        <w:t>Machado CPF: 787.834.108-72</w:t>
       </w:r>
     </w:p>
     <w:p>

</xml_diff>